<commit_message>
fix(security): dynamic RLS policy purge in migration 006, add comprehensive audit script, and refine master reference manual
</commit_message>
<xml_diff>
--- a/المرجع_الشامل_لنظام_أكاديمية_المصري_LMS.docx
+++ b/المرجع_الشامل_لنظام_أكاديمية_المصري_LMS.docx
@@ -273,7 +273,7 @@
                 <w:color w:val="1E293B"/>
                 <w:sz w:val="19"/>
               </w:rPr>
-              <w:t>**حالة الوثيقة:** مرجع معماري وتشغيلي شامل ومحدث وفق الإطلاقة الإنتاجية المحصنة وميجريشن 005 و006 المطبقتين بنجاح.</w:t>
+              <w:t>**حالة الوثيقة:** مرجع معماري وتشغيلي شامل يوثق البنية الإنتاجية المحصنة (Target Hardened Architecture) وميجريشنات التقوية (005 و006) المجهزة في المستودع. حالة التطبيق على قاعدة الإنتاج الحية تخضع لنتائج سكريبت التدقيق الشامل (Comprehensive Live Audit) نظراً لأن التنفيذ تم يدوياً عبر SQL Editor ولم يُسجل في جدول ترحيلات آلي.</w:t>
             </w:r>
           </w:p>
         </w:tc>
@@ -5112,6 +5112,23 @@
     </w:p>
     <w:p>
       <w:pPr>
+        <w:pStyle w:val="Heading3"/>
+        <w:jc w:val="right"/>
+        <w:bidi/>
+      </w:pPr>
+      <w:r>
+        <w:rPr>
+          <w:rFonts w:ascii="Arial" w:hAnsi="Arial"/>
+          <w:b/>
+          <w:color w:val="0F172A"/>
+          <w:sz w:val="23"/>
+        </w:rPr>
+        <w:t>1. الفصل المعماري بين حارس الواجهة وحدود أمان قاعدة البيانات (UX Guard vs Security Boundary):</w:t>
+      </w:r>
+    </w:p>
+    <w:p>
+      <w:pPr>
+        <w:pStyle w:val="ListBullet"/>
         <w:jc w:val="right"/>
         <w:bidi/>
       </w:pPr>
@@ -5121,7 +5138,7 @@
           <w:color w:val="334155"/>
           <w:sz w:val="20"/>
         </w:rPr>
-        <w:t>1. **فرض سياسات الأمان على كافة الجداول (Mandatory Forced RLS):**</w:t>
+        <w:t>**حارس الواجهة الأمامية (`isAdmin` في `App.tsx` و `AuthContext.tsx`):**</w:t>
       </w:r>
     </w:p>
     <w:p>
@@ -5135,11 +5152,58 @@
           <w:color w:val="334155"/>
           <w:sz w:val="20"/>
         </w:rPr>
-        <w:t>تفعيل `FORCE ROW LEVEL SECURITY` على الجداول الـ 8 بالكامل؛ لا يُسمح بأي قراءة أو استعلام إلا للمستخدمين الذين يحققون `public.is_admin() = true`.</w:t>
+        <w:t>هو مجرد حارس لتجربة الاستخدام (UX Guard)؛ وظيفته حجب أزرار التحكم والشاشات وتوجيه أي مستخدم عادي أو غير مصادق لرسالة عدم التصريح وإجباره على تسجيل الخروج.</w:t>
       </w:r>
     </w:p>
+    <w:tbl>
+      <w:tblPr>
+        <w:tblW w:type="auto" w:w="0"/>
+        <w:jc w:val="center"/>
+        <w:tblLook w:firstColumn="1" w:firstRow="1" w:lastColumn="0" w:lastRow="0" w:noHBand="0" w:noVBand="1" w:val="04A0"/>
+        <w:bidiVisual/>
+      </w:tblPr>
+      <w:tblGrid>
+        <w:gridCol w:w="9317"/>
+      </w:tblGrid>
+      <w:tr>
+        <w:tc>
+          <w:tcPr>
+            <w:tcW w:type="dxa" w:w="9317"/>
+            <w:shd w:fill="F1F5F9"/>
+            <w:tcMar>
+              <w:top w:w="100" w:type="dxa"/>
+              <w:bottom w:w="100" w:type="dxa"/>
+              <w:left w:w="150" w:type="dxa"/>
+              <w:right w:w="150" w:type="dxa"/>
+            </w:tcMar>
+            <w:tcBorders>
+              <w:right w:val="single" w:sz="36" w:space="0" w:color="1E3A8A"/>
+              <w:top w:val="none"/>
+              <w:left w:val="none"/>
+              <w:bottom w:val="none"/>
+            </w:tcBorders>
+          </w:tcPr>
+          <w:p>
+            <w:pPr>
+              <w:jc w:val="right"/>
+              <w:bidi/>
+            </w:pPr>
+            <w:r>
+              <w:rPr>
+                <w:rFonts w:ascii="Arial" w:hAnsi="Arial"/>
+                <w:color w:val="1E293B"/>
+                <w:sz w:val="19"/>
+              </w:rPr>
+              <w:t>⚠️ **تنبيه معماري حاسم:** حارس الواجهة لا يُعتبر حداً أمنياً (Not a Security Boundary)؛ لأن أي مستخدم يستطيع استخراج مفتاح `anon` واستدعاء واجهة PostgREST مباشرة عبر أدوات مثل cURL أو Postman أو دوال المتصفح.</w:t>
+            </w:r>
+          </w:p>
+        </w:tc>
+      </w:tr>
+    </w:tbl>
+    <w:p/>
     <w:p>
       <w:pPr>
+        <w:pStyle w:val="ListBullet"/>
         <w:jc w:val="right"/>
         <w:bidi/>
       </w:pPr>
@@ -5149,7 +5213,7 @@
           <w:color w:val="334155"/>
           <w:sz w:val="20"/>
         </w:rPr>
-        <w:t>2. **سحب صلاحيات التعديل المباشر من PostgREST:**</w:t>
+        <w:t>**الحد الأمني الحقيقي والوحيد (The True Security Boundary):**</w:t>
       </w:r>
     </w:p>
     <w:p>
@@ -5163,11 +5227,28 @@
           <w:color w:val="334155"/>
           <w:sz w:val="20"/>
         </w:rPr>
-        <w:t>سحب أوامر `INSERT, UPDATE, DELETE` من كافة الجداول المالية للمستخدمين؛ الحركات المالية تتم حصرياً عبر دوال `SECURITY DEFINER` المعتمدة.</w:t>
+        <w:t>يقع حصرياً داخل محرك PostgreSQL عبر تفعيل سياسات `FORCE ROW LEVEL SECURITY` الصارمة، وحراسة دوال المعالجة المالية `SECURITY DEFINER` بفحص العضوية الصريح `public.is_admin()`.</w:t>
       </w:r>
     </w:p>
     <w:p>
       <w:pPr>
+        <w:pStyle w:val="Heading3"/>
+        <w:jc w:val="right"/>
+        <w:bidi/>
+      </w:pPr>
+      <w:r>
+        <w:rPr>
+          <w:rFonts w:ascii="Arial" w:hAnsi="Arial"/>
+          <w:b/>
+          <w:color w:val="0F172A"/>
+          <w:sz w:val="23"/>
+        </w:rPr>
+        <w:t>2. معضلة السياسات التراكمية في PostgreSQL وحلقة المسح الشاملة (RLS Dynamic Purge):</w:t>
+      </w:r>
+    </w:p>
+    <w:p>
+      <w:pPr>
+        <w:pStyle w:val="ListBullet"/>
         <w:jc w:val="right"/>
         <w:bidi/>
       </w:pPr>
@@ -5177,7 +5258,7 @@
           <w:color w:val="334155"/>
           <w:sz w:val="20"/>
         </w:rPr>
-        <w:t>3. **حماية الواجهة الأمامية (UI Admin Guard):**</w:t>
+        <w:t>**المعضلة الهندسية:** في PostgreSQL، تُجمع السياسات المسموحة (Permissive Policies) دائماً بمنطق `OR`.</w:t>
       </w:r>
     </w:p>
     <w:p>
@@ -5191,11 +5272,12 @@
           <w:color w:val="334155"/>
           <w:sz w:val="20"/>
         </w:rPr>
-        <w:t>في `App.tsx` و `AuthContext.tsx`، تم بناء فاحص أمني إلزامي يمنع أي مستخدم مصادق لا يملك صفة مسؤول من فتح الداشبورد أو الشاشات، مع إظهار شاشة حظر فورية وإجباره على تسجيل الخروج.</w:t>
+        <w:t>إذا وُجدت أي سياسة قديمة متوارثة من ميجريشنات سابقة (مثل `anon_select_students` أو `anon_insert_students` من ميجريشن 001، أو `Allow authenticated read`)، فإن هذه السياسة الواسعة **تبطل تماماً وتلغي أثر** سياسة حصر البيانات على المديرين (`admins_admin_only_policy`).</w:t>
       </w:r>
     </w:p>
     <w:p>
       <w:pPr>
+        <w:pStyle w:val="ListBullet"/>
         <w:jc w:val="right"/>
         <w:bidi/>
       </w:pPr>
@@ -5205,7 +5287,7 @@
           <w:color w:val="334155"/>
           <w:sz w:val="20"/>
         </w:rPr>
-        <w:t>4. **حماية ملفات إكسيل من الاختراق (CSV Formula Injection Protection):**</w:t>
+        <w:t>**الحل الجذري المعتمد في ميجريشن 006:**</w:t>
       </w:r>
     </w:p>
     <w:p>
@@ -5219,13 +5301,89 @@
           <w:color w:val="334155"/>
           <w:sz w:val="20"/>
         </w:rPr>
-        <w:t>في `exportExcel.ts`، تعقيم أي نصوص أو أسماء تبدأ بالرموز الحسابية (`=`, `+`, `-`, `@`, `</w:t>
-        <w:tab/>
-        <w:t>`, `</w:t>
+        <w:t>تنفيذ حلقة مسح ديناميكية حاسمة (Dynamic PL/pgSQL Purge Loop) تستعلم من جدول النظام `pg_policies` وتحذف **كل** السياسات السابقة بدون استثناء على الجداول الـ 8 الأساسية قبل إنشاء السياسات الجديدة:</w:t>
+      </w:r>
+    </w:p>
+    <w:tbl>
+      <w:tblPr>
+        <w:tblW w:type="auto" w:w="0"/>
+        <w:jc w:val="center"/>
+        <w:tblLook w:firstColumn="1" w:firstRow="1" w:lastColumn="0" w:lastRow="0" w:noHBand="0" w:noVBand="1" w:val="04A0"/>
+        <w:bidiVisual/>
+      </w:tblPr>
+      <w:tblGrid>
+        <w:gridCol w:w="9317"/>
+      </w:tblGrid>
+      <w:tr>
+        <w:tc>
+          <w:tcPr>
+            <w:tcW w:type="dxa" w:w="9317"/>
+            <w:shd w:fill="0F172A"/>
+            <w:tcMar>
+              <w:top w:w="140" w:type="dxa"/>
+              <w:bottom w:w="140" w:type="dxa"/>
+              <w:left w:w="180" w:type="dxa"/>
+              <w:right w:w="180" w:type="dxa"/>
+            </w:tcMar>
+          </w:tcPr>
+          <w:p>
+            <w:pPr>
+              <w:jc w:val="left"/>
+            </w:pPr>
+            <w:r>
+              <w:rPr>
+                <w:rFonts w:ascii="Consolas" w:hAnsi="Consolas"/>
+                <w:color w:val="E2E8F0"/>
+                <w:sz w:val="17"/>
+              </w:rPr>
+              <w:t>DO $$</w:t>
+              <w:br/>
+              <w:t>DECLARE r RECORD;</w:t>
+              <w:br/>
+              <w:t>BEGIN</w:t>
+              <w:br/>
+              <w:t xml:space="preserve">  FOR r IN (</w:t>
+              <w:br/>
+              <w:t xml:space="preserve">    SELECT schemaname, tablename, policyname</w:t>
+              <w:br/>
+              <w:t xml:space="preserve">    FROM pg_policies</w:t>
+              <w:br/>
+              <w:t xml:space="preserve">    WHERE schemaname = 'public'</w:t>
+              <w:br/>
+              <w:t xml:space="preserve">      AND tablename IN ('admins', 'students', 'courses', 'cash_boxes', 'enrollments', 'payments', 'expenses', 'cash_box_transfers')</w:t>
+              <w:br/>
+              <w:t xml:space="preserve">  ) LOOP</w:t>
+              <w:br/>
+              <w:t xml:space="preserve">    EXECUTE format('DROP POLICY IF EXISTS %I ON %I.%I', r.policyname, r.schemaname, r.tablename);</w:t>
+              <w:br/>
+              <w:t xml:space="preserve">  END LOOP;</w:t>
+              <w:br/>
+              <w:t>END $$;</w:t>
+            </w:r>
+          </w:p>
+        </w:tc>
+      </w:tr>
+    </w:tbl>
+    <w:p/>
+    <w:p>
+      <w:pPr>
+        <w:pStyle w:val="Heading3"/>
+        <w:jc w:val="right"/>
+        <w:bidi/>
+      </w:pPr>
+      <w:r>
+        <w:rPr>
+          <w:rFonts w:ascii="Arial" w:hAnsi="Arial"/>
+          <w:b/>
+          <w:color w:val="0F172A"/>
+          <w:sz w:val="23"/>
+        </w:rPr>
+        <w:t>3. سحب الصلاحيات المباشرة وإلغاء صلاحيات anon و PUBLIC:</w:t>
       </w:r>
     </w:p>
     <w:p>
       <w:pPr>
+        <w:pStyle w:val="ListBullet"/>
         <w:jc w:val="right"/>
         <w:bidi/>
       </w:pPr>
@@ -5235,11 +5393,12 @@
           <w:color w:val="334155"/>
           <w:sz w:val="20"/>
         </w:rPr>
-        <w:t>`) ببادئة اقتباس `'` لمنع تنفيذ أي معادلات خبيثة عند فتح الملفات داخل Microsoft Excel.</w:t>
+        <w:t>تنفيذ `REVOKE ALL ON TABLE ... FROM PUBLIC, anon` لمنع أي استعلام أو تعديل مباشر عبر مفتاح anon بدون جلسة مدير مصادقة.</w:t>
       </w:r>
     </w:p>
     <w:p>
       <w:pPr>
+        <w:pStyle w:val="ListBullet"/>
         <w:jc w:val="right"/>
         <w:bidi/>
       </w:pPr>
@@ -5249,11 +5408,28 @@
           <w:color w:val="334155"/>
           <w:sz w:val="20"/>
         </w:rPr>
-        <w:t>5. **توضيح خاصية Leaked Password Protection في Supabase:**</w:t>
+        <w:t>قصر عمليات التعديل المالي (Payments, Expenses, Transfers) على دوال `SECURITY DEFINER` المعتمدة لمنع التلاعب بالأرصدة.</w:t>
       </w:r>
     </w:p>
     <w:p>
       <w:pPr>
+        <w:pStyle w:val="Heading3"/>
+        <w:jc w:val="right"/>
+        <w:bidi/>
+      </w:pPr>
+      <w:r>
+        <w:rPr>
+          <w:rFonts w:ascii="Arial" w:hAnsi="Arial"/>
+          <w:b/>
+          <w:color w:val="0F172A"/>
+          <w:sz w:val="23"/>
+        </w:rPr>
+        <w:t>4. تحصين ملفات التقارير وإكسيل من هجمات الحقن (CSV Formula Injection Protection):</w:t>
+      </w:r>
+    </w:p>
+    <w:p>
+      <w:pPr>
+        <w:pStyle w:val="ListBullet"/>
         <w:jc w:val="right"/>
         <w:bidi/>
       </w:pPr>
@@ -5263,7 +5439,99 @@
           <w:color w:val="334155"/>
           <w:sz w:val="20"/>
         </w:rPr>
-        <w:t>الخاصية في Supabase تتطلب باقة Pro مدفوعة ($25/شهر) لاستهلاك API من HaveIBeenPwned. المنصة تعمل في بيئة مغلقة (No Public Signup) حيث الحسابات إدارية منشأة يدوياً ومحمية بـ RLS المطبق بنسبة 100%.</w:t>
+        <w:t>في ملف `src/lib/exportExcel.ts`، يتم فحص كل حقل نصي قبل التصدير.</w:t>
+      </w:r>
+    </w:p>
+    <w:p>
+      <w:pPr>
+        <w:pStyle w:val="ListBullet"/>
+        <w:jc w:val="right"/>
+        <w:bidi/>
+      </w:pPr>
+      <w:r>
+        <w:rPr>
+          <w:rFonts w:ascii="Arial" w:hAnsi="Arial"/>
+          <w:color w:val="334155"/>
+          <w:sz w:val="20"/>
+        </w:rPr>
+        <w:t>إذا كانت القيمة النصية تبدأ بأي رمز من الرموز الحسابية أو التشغيلية الخطرة (`=`, `+`, `-`, `@`, `</w:t>
+        <w:tab/>
+        <w:t>`, `</w:t>
+      </w:r>
+    </w:p>
+    <w:p>
+      <w:pPr>
+        <w:jc w:val="right"/>
+        <w:bidi/>
+      </w:pPr>
+      <w:r>
+        <w:rPr>
+          <w:rFonts w:ascii="Arial" w:hAnsi="Arial"/>
+          <w:color w:val="334155"/>
+          <w:sz w:val="20"/>
+        </w:rPr>
+        <w:t>`)، يتم حقن علامة اقتباس مفردة `'` كبادئة للخلية لإلغاء تفسيرها كمعادلة تنفيذية داخل برامج Excel وتثبيتها كنص نقي آمن.</w:t>
+      </w:r>
+    </w:p>
+    <w:p>
+      <w:pPr>
+        <w:pStyle w:val="Heading3"/>
+        <w:jc w:val="right"/>
+        <w:bidi/>
+      </w:pPr>
+      <w:r>
+        <w:rPr>
+          <w:rFonts w:ascii="Arial" w:hAnsi="Arial"/>
+          <w:b/>
+          <w:color w:val="0F172A"/>
+          <w:sz w:val="23"/>
+        </w:rPr>
+        <w:t>5. التدقيق الهندسي لخاصية حماية كلمات المرور (Leaked Password Protection):</w:t>
+      </w:r>
+    </w:p>
+    <w:p>
+      <w:pPr>
+        <w:pStyle w:val="ListBullet"/>
+        <w:jc w:val="right"/>
+        <w:bidi/>
+      </w:pPr>
+      <w:r>
+        <w:rPr>
+          <w:rFonts w:ascii="Arial" w:hAnsi="Arial"/>
+          <w:color w:val="334155"/>
+          <w:sz w:val="20"/>
+        </w:rPr>
+        <w:t>**تسعير وباقات Supabase:** فحص كلمات المرور المسربة عبر تكامل API الرسمي مع HaveIBeenPwned.org متاح حصرياً في باقات Supabase المدفوعة (Pro Plans وما فوق) ولا يتوفر في الباقة المجانية (Free Tier).</w:t>
+      </w:r>
+    </w:p>
+    <w:p>
+      <w:pPr>
+        <w:pStyle w:val="ListBullet"/>
+        <w:jc w:val="right"/>
+        <w:bidi/>
+      </w:pPr>
+      <w:r>
+        <w:rPr>
+          <w:rFonts w:ascii="Arial" w:hAnsi="Arial"/>
+          <w:color w:val="334155"/>
+          <w:sz w:val="20"/>
+        </w:rPr>
+        <w:t>**الحدود الأمنية لإيقاف التسجيل العام:** إيقاف التسجيل العام (Disable Public Signups) واقتصار التسجيل على الحسابات المنشأة يدوياً يمنع تسجيل المتسللين، ولكنه **لا يحمي** حسابات المديرين الحالية إذا اختار أحد المديرين كلمة مرور ضعيفة أو متسربة في اختراقات سابقة.</w:t>
+      </w:r>
+    </w:p>
+    <w:p>
+      <w:pPr>
+        <w:pStyle w:val="ListBullet"/>
+        <w:jc w:val="right"/>
+        <w:bidi/>
+      </w:pPr>
+      <w:r>
+        <w:rPr>
+          <w:rFonts w:ascii="Arial" w:hAnsi="Arial"/>
+          <w:color w:val="334155"/>
+          <w:sz w:val="20"/>
+        </w:rPr>
+        <w:t>**التوصية التشغيلية:** تفعيل فحص كلمات المرور فور ترقية المشروع إلى باقة Pro، والالتزام بسياسة تعقيد صارمة لحسابات المديرين حالياً.</w:t>
       </w:r>
     </w:p>
     <w:p>
@@ -5877,7 +6145,7 @@
                 <w:color w:val="FFFFFF"/>
                 <w:sz w:val="18"/>
               </w:rPr>
-              <w:t>الحالة وتاريخ الاعتماد</w:t>
+              <w:t>الحالة والتوثيق</w:t>
             </w:r>
           </w:p>
         </w:tc>
@@ -5904,7 +6172,7 @@
                 <w:color w:val="FFFFFF"/>
                 <w:sz w:val="18"/>
               </w:rPr>
-              <w:t>التغييرات المحققة</w:t>
+              <w:t>التغييرات ونطاق المعالجة</w:t>
             </w:r>
           </w:p>
         </w:tc>
@@ -5984,7 +6252,7 @@
                 <w:color w:val="1E293B"/>
                 <w:sz w:val="18"/>
               </w:rPr>
-              <w:t>مؤرشف (تأسيسي قديم)</w:t>
+              <w:t>مؤرشف (تأسيسي محلي قديم)</w:t>
             </w:r>
           </w:p>
         </w:tc>
@@ -6010,7 +6278,7 @@
                 <w:color w:val="1E293B"/>
                 <w:sz w:val="18"/>
               </w:rPr>
-              <w:t>إنشاء الجداول الأساسية المبدئية.</w:t>
+              <w:t>إنشاء الجداول الأساسية المبدئية بنظام المعرفات `id` وسياسات anon تجريبية.</w:t>
             </w:r>
           </w:p>
         </w:tc>
@@ -6116,7 +6384,7 @@
                 <w:color w:val="1E293B"/>
                 <w:sz w:val="18"/>
               </w:rPr>
-              <w:t>فيوهات محاسبية مبدئية.</w:t>
+              <w:t>فيوهات محاسبية مبدئية تعتمد على عمود `voided` القديم.</w:t>
             </w:r>
           </w:p>
         </w:tc>
@@ -6222,7 +6490,7 @@
                 <w:color w:val="1E293B"/>
                 <w:sz w:val="18"/>
               </w:rPr>
-              <w:t>دوال RPC مبدئية.</w:t>
+              <w:t>دوال RPC مبدئية بدون حراسة إدارية داخلية.</w:t>
             </w:r>
           </w:p>
         </w:tc>
@@ -6328,7 +6596,7 @@
                 <w:color w:val="1E293B"/>
                 <w:sz w:val="18"/>
               </w:rPr>
-              <w:t>قيود وبيانات تجريبية.</w:t>
+              <w:t>قيود وبيانات تجريبية أولية.</w:t>
             </w:r>
           </w:p>
         </w:tc>
@@ -6408,7 +6676,7 @@
                 <w:color w:val="1E293B"/>
                 <w:sz w:val="18"/>
               </w:rPr>
-              <w:t>**مطبّق ومعتمد** (21 أكتوبر 2026)</w:t>
+              <w:t>**موثق في المستودع** (مخطط الإنتاج `*_id`)</w:t>
             </w:r>
           </w:p>
         </w:tc>
@@ -6434,7 +6702,7 @@
                 <w:color w:val="1E293B"/>
                 <w:sz w:val="18"/>
               </w:rPr>
-              <w:t>توليد رقم إيصال Sequence، تريجرز منع الحذف، وأقفال التحويل الذرية.</w:t>
+              <w:t>ترقيم إيصالات تسلسلي Sequence، تريجرز منع الحذف والتعديل، وأقفال التحويل الذرية. يتطلب إثبات الحالة الحية عبر سكريبت التدقيق.</w:t>
             </w:r>
           </w:p>
         </w:tc>
@@ -6514,7 +6782,7 @@
                 <w:color w:val="1E293B"/>
                 <w:sz w:val="18"/>
               </w:rPr>
-              <w:t>**مطبّق ومعتمد** (21 أكتوبر 2026)</w:t>
+              <w:t>**موثق في المستودع ومحدّث** (أكتوبر 2026)</w:t>
             </w:r>
           </w:p>
         </w:tc>
@@ -6540,7 +6808,99 @@
                 <w:color w:val="1E293B"/>
                 <w:sz w:val="18"/>
               </w:rPr>
-              <w:t>فرض RLS الصارم للمديرين فقط، حماية دوال التحصيل والمصروفات بـ is_admin، وتوحيد فيو enrollment_balances.</w:t>
+              <w:t>حلقة مسح ديناميكية لسياسات RLS، حصر الوصول للمديرين فقط، حراسة `is_admin` لدوال التحصيل والمصروفات، وتوحيد الأرصدة على `voided_at IS NULL`.</w:t>
+            </w:r>
+          </w:p>
+        </w:tc>
+      </w:tr>
+    </w:tbl>
+    <w:p/>
+    <w:tbl>
+      <w:tblPr>
+        <w:tblW w:type="auto" w:w="0"/>
+        <w:jc w:val="center"/>
+        <w:tblLook w:firstColumn="1" w:firstRow="1" w:lastColumn="0" w:lastRow="0" w:noHBand="0" w:noVBand="1" w:val="04A0"/>
+        <w:bidiVisual/>
+      </w:tblPr>
+      <w:tblGrid>
+        <w:gridCol w:w="9317"/>
+      </w:tblGrid>
+      <w:tr>
+        <w:tc>
+          <w:tcPr>
+            <w:tcW w:type="dxa" w:w="9317"/>
+            <w:shd w:fill="F1F5F9"/>
+            <w:tcMar>
+              <w:top w:w="100" w:type="dxa"/>
+              <w:bottom w:w="100" w:type="dxa"/>
+              <w:left w:w="150" w:type="dxa"/>
+              <w:right w:w="150" w:type="dxa"/>
+            </w:tcMar>
+            <w:tcBorders>
+              <w:right w:val="single" w:sz="36" w:space="0" w:color="1E3A8A"/>
+              <w:top w:val="none"/>
+              <w:left w:val="none"/>
+              <w:bottom w:val="none"/>
+            </w:tcBorders>
+          </w:tcPr>
+          <w:p>
+            <w:pPr>
+              <w:jc w:val="right"/>
+              <w:bidi/>
+            </w:pPr>
+            <w:r>
+              <w:rPr>
+                <w:rFonts w:ascii="Arial" w:hAnsi="Arial"/>
+                <w:color w:val="1E293B"/>
+                <w:sz w:val="19"/>
+              </w:rPr>
+              <w:t>📌 **ملاحظة معمارية للمطابقة الحية:**</w:t>
+            </w:r>
+          </w:p>
+        </w:tc>
+      </w:tr>
+    </w:tbl>
+    <w:p/>
+    <w:tbl>
+      <w:tblPr>
+        <w:tblW w:type="auto" w:w="0"/>
+        <w:jc w:val="center"/>
+        <w:tblLook w:firstColumn="1" w:firstRow="1" w:lastColumn="0" w:lastRow="0" w:noHBand="0" w:noVBand="1" w:val="04A0"/>
+        <w:bidiVisual/>
+      </w:tblPr>
+      <w:tblGrid>
+        <w:gridCol w:w="9317"/>
+      </w:tblGrid>
+      <w:tr>
+        <w:tc>
+          <w:tcPr>
+            <w:tcW w:type="dxa" w:w="9317"/>
+            <w:shd w:fill="F1F5F9"/>
+            <w:tcMar>
+              <w:top w:w="100" w:type="dxa"/>
+              <w:bottom w:w="100" w:type="dxa"/>
+              <w:left w:w="150" w:type="dxa"/>
+              <w:right w:w="150" w:type="dxa"/>
+            </w:tcMar>
+            <w:tcBorders>
+              <w:right w:val="single" w:sz="36" w:space="0" w:color="1E3A8A"/>
+              <w:top w:val="none"/>
+              <w:left w:val="none"/>
+              <w:bottom w:val="none"/>
+            </w:tcBorders>
+          </w:tcPr>
+          <w:p>
+            <w:pPr>
+              <w:jc w:val="right"/>
+              <w:bidi/>
+            </w:pPr>
+            <w:r>
+              <w:rPr>
+                <w:rFonts w:ascii="Arial" w:hAnsi="Arial"/>
+                <w:color w:val="1E293B"/>
+                <w:sz w:val="19"/>
+              </w:rPr>
+              <w:t>نظراً لأن الترحيلات طُبقت في بيئة Supabase الحية عبر نافذة الاستعلامات (SQL Editor) ولم تُدرج عبر أداة Supabase CLI في جدول ترحيلات آلي، فإن الحكم النهائي على مطابقة قاعدة البيانات لا يعتمد على افتراضات المستودع، بل يستند حصرياً إلى نتائج تشغيل سكريبت التدقيق الشامل `trainerpro_comprehensive_audit.sql`.</w:t>
             </w:r>
           </w:p>
         </w:tc>
@@ -6988,7 +7348,7 @@
           <w:color w:val="334155"/>
           <w:sz w:val="20"/>
         </w:rPr>
-        <w:t>**تاريخ مراجعة واعتماد المرجع:** 21 أكتوبر 2026.</w:t>
+        <w:t>**تاريخ مراجعة وتحديث المرجع:** 21 أكتوبر 2026.</w:t>
       </w:r>
     </w:p>
     <w:p>
@@ -7003,7 +7363,7 @@
           <w:color w:val="334155"/>
           <w:sz w:val="20"/>
         </w:rPr>
-        <w:t>**الحالة:** مرجع معماري وتشغيلي نهائي مطابق 100% لكود المستودع وقاعدة البيانات الحية بعد تطبيق ترحيلات التقوية والأمان 005 و006.</w:t>
+        <w:t>**الحالة:** مرجع معماري وتشغيلي دقيق يوثق كود المستودع والمعمارية الإنتاجية المستهدفة. التحقق النهائي من مطابقة قاعدة البيانات الحية بنسبة 100% يرتبط بفحص مخرجات سكريبت التدقيق الشامل `trainerpro_comprehensive_audit.sql`.</w:t>
       </w:r>
     </w:p>
     <w:sectPr>

</xml_diff>

<commit_message>
feat(security): create migration 007 for standalone RLS purge and update audit script v2 with forensic checks
</commit_message>
<xml_diff>
--- a/المرجع_الشامل_لنظام_أكاديمية_المصري_LMS.docx
+++ b/المرجع_الشامل_لنظام_أكاديمية_المصري_LMS.docx
@@ -273,7 +273,7 @@
                 <w:color w:val="1E293B"/>
                 <w:sz w:val="19"/>
               </w:rPr>
-              <w:t>**حالة الوثيقة:** مرجع معماري وتشغيلي شامل يوثق البنية الإنتاجية المحصنة (Target Hardened Architecture) وميجريشنات التقوية (005 و006) المجهزة في المستودع. حالة التطبيق على قاعدة الإنتاج الحية تخضع لنتائج سكريبت التدقيق الشامل (Comprehensive Live Audit) نظراً لأن التنفيذ تم يدوياً عبر SQL Editor ولم يُسجل في جدول ترحيلات آلي.</w:t>
+              <w:t>**حالة الوثيقة:** مرجع معماري وتشغيلي شامل يوثق البنية الإنتاجية المحصنة (Target Hardened Architecture) وميجريشنات التقوية (005 و006 و007) المجهزة في المستودع. حالة التطبيق على قاعدة الإنتاج الحية تخضع لنتائج سكريبت التدقيق الشامل (Comprehensive Live Audit) نظراً لأن التنفيذ تم يدوياً عبر SQL Editor ولم يُسجل في جدول ترحيلات آلي.</w:t>
             </w:r>
           </w:p>
         </w:tc>
@@ -6782,7 +6782,7 @@
                 <w:color w:val="1E293B"/>
                 <w:sz w:val="18"/>
               </w:rPr>
-              <w:t>**موثق في المستودع ومحدّث** (أكتوبر 2026)</w:t>
+              <w:t>**موثق في المستودع** (أكتوبر 2026)</w:t>
             </w:r>
           </w:p>
         </w:tc>
@@ -6808,7 +6808,113 @@
                 <w:color w:val="1E293B"/>
                 <w:sz w:val="18"/>
               </w:rPr>
-              <w:t>حلقة مسح ديناميكية لسياسات RLS، حصر الوصول للمديرين فقط، حراسة `is_admin` لدوال التحصيل والمصروفات، وتوحيد الأرصدة على `voided_at IS NULL`.</w:t>
+              <w:t>حراسة `is_admin` لدوال التحصيل والمصروفات، وتسجيل `added_by = auth.uid()`، وتوحيد الأرصدة على `voided_at IS NULL`.</w:t>
+            </w:r>
+          </w:p>
+        </w:tc>
+      </w:tr>
+      <w:tr>
+        <w:tc>
+          <w:tcPr>
+            <w:tcW w:type="dxa" w:w="2329"/>
+            <w:tcMar>
+              <w:top w:w="120" w:type="dxa"/>
+              <w:bottom w:w="120" w:type="dxa"/>
+              <w:left w:w="140" w:type="dxa"/>
+              <w:right w:w="140" w:type="dxa"/>
+            </w:tcMar>
+            <w:shd w:fill="F8FAFC"/>
+          </w:tcPr>
+          <w:p>
+            <w:pPr>
+              <w:jc w:val="right"/>
+              <w:bidi/>
+            </w:pPr>
+            <w:r>
+              <w:rPr>
+                <w:rFonts w:ascii="Arial" w:hAnsi="Arial"/>
+                <w:color w:val="1E293B"/>
+                <w:sz w:val="18"/>
+              </w:rPr>
+              <w:t>`007`</w:t>
+            </w:r>
+          </w:p>
+        </w:tc>
+        <w:tc>
+          <w:tcPr>
+            <w:tcW w:type="dxa" w:w="2329"/>
+            <w:tcMar>
+              <w:top w:w="120" w:type="dxa"/>
+              <w:bottom w:w="120" w:type="dxa"/>
+              <w:left w:w="140" w:type="dxa"/>
+              <w:right w:w="140" w:type="dxa"/>
+            </w:tcMar>
+            <w:shd w:fill="F8FAFC"/>
+          </w:tcPr>
+          <w:p>
+            <w:pPr>
+              <w:jc w:val="right"/>
+              <w:bidi/>
+            </w:pPr>
+            <w:r>
+              <w:rPr>
+                <w:rFonts w:ascii="Arial" w:hAnsi="Arial"/>
+                <w:color w:val="1E293B"/>
+                <w:sz w:val="18"/>
+              </w:rPr>
+              <w:t>`202610210007_purge_legacy_rls_and_revoke_public.sql`</w:t>
+            </w:r>
+          </w:p>
+        </w:tc>
+        <w:tc>
+          <w:tcPr>
+            <w:tcW w:type="dxa" w:w="2329"/>
+            <w:tcMar>
+              <w:top w:w="120" w:type="dxa"/>
+              <w:bottom w:w="120" w:type="dxa"/>
+              <w:left w:w="140" w:type="dxa"/>
+              <w:right w:w="140" w:type="dxa"/>
+            </w:tcMar>
+            <w:shd w:fill="F8FAFC"/>
+          </w:tcPr>
+          <w:p>
+            <w:pPr>
+              <w:jc w:val="right"/>
+              <w:bidi/>
+            </w:pPr>
+            <w:r>
+              <w:rPr>
+                <w:rFonts w:ascii="Arial" w:hAnsi="Arial"/>
+                <w:color w:val="1E293B"/>
+                <w:sz w:val="18"/>
+              </w:rPr>
+              <w:t>**ميجريشن تصحيحي مستقل** (أكتوبر 2026)</w:t>
+            </w:r>
+          </w:p>
+        </w:tc>
+        <w:tc>
+          <w:tcPr>
+            <w:tcW w:type="dxa" w:w="2329"/>
+            <w:tcMar>
+              <w:top w:w="120" w:type="dxa"/>
+              <w:bottom w:w="120" w:type="dxa"/>
+              <w:left w:w="140" w:type="dxa"/>
+              <w:right w:w="140" w:type="dxa"/>
+            </w:tcMar>
+            <w:shd w:fill="F8FAFC"/>
+          </w:tcPr>
+          <w:p>
+            <w:pPr>
+              <w:jc w:val="right"/>
+              <w:bidi/>
+            </w:pPr>
+            <w:r>
+              <w:rPr>
+                <w:rFonts w:ascii="Arial" w:hAnsi="Arial"/>
+                <w:color w:val="1E293B"/>
+                <w:sz w:val="18"/>
+              </w:rPr>
+              <w:t>حلقة مسح ديناميكية لكافة سياسات RLS السابقة، سحب الصلاحيات من `PUBLIC` و `anon`، وإنشاء السياسات الإدارية الحصرية.</w:t>
             </w:r>
           </w:p>
         </w:tc>

</xml_diff>

<commit_message>
docs: certify master reference manual with live production forensic audit findings
</commit_message>
<xml_diff>
--- a/المرجع_الشامل_لنظام_أكاديمية_المصري_LMS.docx
+++ b/المرجع_الشامل_لنظام_أكاديمية_المصري_LMS.docx
@@ -273,7 +273,7 @@
                 <w:color w:val="1E293B"/>
                 <w:sz w:val="19"/>
               </w:rPr>
-              <w:t>**حالة الوثيقة:** مرجع معماري وتشغيلي شامل يوثق البنية الإنتاجية المحصنة (Target Hardened Architecture) وميجريشنات التقوية (005 و006 و007) المجهزة في المستودع. حالة التطبيق على قاعدة الإنتاج الحية تخضع لنتائج سكريبت التدقيق الشامل (Comprehensive Live Audit) نظراً لأن التنفيذ تم يدوياً عبر SQL Editor ولم يُسجل في جدول ترحيلات آلي.</w:t>
+              <w:t>**حالة الوثيقة:** مرجع معماري وتشغيلي معتمد ومثبت بالدليل الجنائي على قاعدة الإنتاج الحية (Live Database Verified). تم إثبات تطبيق FORCE RLS على الـ 8 جداول، وتحصين كافة الدوال الـ 8 بـ is_admin() و SECURITY DEFINER، وتوثيق audit trail عبر auth.uid()، مع خلو القاعدة من أي سياسات anon مسربة.</w:t>
             </w:r>
           </w:p>
         </w:tc>
@@ -5536,6 +5536,153 @@
     </w:p>
     <w:p>
       <w:pPr>
+        <w:pStyle w:val="Heading3"/>
+        <w:jc w:val="right"/>
+        <w:bidi/>
+      </w:pPr>
+      <w:r>
+        <w:rPr>
+          <w:rFonts w:ascii="Arial" w:hAnsi="Arial"/>
+          <w:b/>
+          <w:color w:val="0F172A"/>
+          <w:sz w:val="23"/>
+        </w:rPr>
+        <w:t>6. مصفوفة التحقق الجنائي المثبتة على قاعدة الإنتاج الحية (Live Forensic Audit Matrix):</w:t>
+      </w:r>
+    </w:p>
+    <w:p>
+      <w:pPr>
+        <w:jc w:val="right"/>
+        <w:bidi/>
+      </w:pPr>
+      <w:r>
+        <w:rPr>
+          <w:rFonts w:ascii="Arial" w:hAnsi="Arial"/>
+          <w:color w:val="334155"/>
+          <w:sz w:val="20"/>
+        </w:rPr>
+        <w:t>أثبتت نتائج تشغيل سكريبت التدقيق الجنائي `trainerpro_comprehensive_audit.sql` على قاعدة بيانات الإنتاج الحية ما يلي:</w:t>
+      </w:r>
+    </w:p>
+    <w:p>
+      <w:pPr>
+        <w:jc w:val="right"/>
+        <w:bidi/>
+      </w:pPr>
+      <w:r>
+        <w:rPr>
+          <w:rFonts w:ascii="Arial" w:hAnsi="Arial"/>
+          <w:color w:val="334155"/>
+          <w:sz w:val="20"/>
+        </w:rPr>
+        <w:t>1. **الجداول الأساسية (8 من أصل 8):** مفعل عليها `rls_enabled = true` و `force_rls_enabled = true` بنسبة 100%.</w:t>
+      </w:r>
+    </w:p>
+    <w:p>
+      <w:pPr>
+        <w:jc w:val="right"/>
+        <w:bidi/>
+      </w:pPr>
+      <w:r>
+        <w:rPr>
+          <w:rFonts w:ascii="Arial" w:hAnsi="Arial"/>
+          <w:color w:val="334155"/>
+          <w:sz w:val="20"/>
+        </w:rPr>
+        <w:t>2. **سياسات الأمان RLS:** لا توجد أي سياسة ممنوحة لدور `anon` أو `PUBLIC`؛ جميع السياسات مقصورة على `{authenticated}` وتلزم شرط `is_admin()`.</w:t>
+      </w:r>
+    </w:p>
+    <w:p>
+      <w:pPr>
+        <w:jc w:val="right"/>
+        <w:bidi/>
+      </w:pPr>
+      <w:r>
+        <w:rPr>
+          <w:rFonts w:ascii="Arial" w:hAnsi="Arial"/>
+          <w:color w:val="334155"/>
+          <w:sz w:val="20"/>
+        </w:rPr>
+        <w:t>3. **الدوال المعالجة (8 من أصل 8):**</w:t>
+      </w:r>
+    </w:p>
+    <w:p>
+      <w:pPr>
+        <w:pStyle w:val="ListBullet"/>
+        <w:jc w:val="right"/>
+        <w:bidi/>
+      </w:pPr>
+      <w:r>
+        <w:rPr>
+          <w:rFonts w:ascii="Arial" w:hAnsi="Arial"/>
+          <w:color w:val="334155"/>
+          <w:sz w:val="20"/>
+        </w:rPr>
+        <w:t>كافة الدوال تعمل بـ `is_security_definer = true` وتضبط `search_path = pg_catalog, public`.</w:t>
+      </w:r>
+    </w:p>
+    <w:p>
+      <w:pPr>
+        <w:pStyle w:val="ListBullet"/>
+        <w:jc w:val="right"/>
+        <w:bidi/>
+      </w:pPr>
+      <w:r>
+        <w:rPr>
+          <w:rFonts w:ascii="Arial" w:hAnsi="Arial"/>
+          <w:color w:val="334155"/>
+          <w:sz w:val="20"/>
+        </w:rPr>
+        <w:t>مالك الدوال هو `postgres` مع `owner_bypasses_rls = true` مما يمكنها من قراءة جدول المسؤولين وتخطي حلقة التكرار تحت مظلة `FORCE RLS`.</w:t>
+      </w:r>
+    </w:p>
+    <w:p>
+      <w:pPr>
+        <w:pStyle w:val="ListBullet"/>
+        <w:jc w:val="right"/>
+        <w:bidi/>
+      </w:pPr>
+      <w:r>
+        <w:rPr>
+          <w:rFonts w:ascii="Arial" w:hAnsi="Arial"/>
+          <w:color w:val="334155"/>
+          <w:sz w:val="20"/>
+        </w:rPr>
+        <w:t>كافة الدوال الـ 8 تفحص العضوية الإدارية بـ `checks_is_admin = true`.</w:t>
+      </w:r>
+    </w:p>
+    <w:p>
+      <w:pPr>
+        <w:pStyle w:val="ListBullet"/>
+        <w:jc w:val="right"/>
+        <w:bidi/>
+      </w:pPr>
+      <w:r>
+        <w:rPr>
+          <w:rFonts w:ascii="Arial" w:hAnsi="Arial"/>
+          <w:color w:val="334155"/>
+          <w:sz w:val="20"/>
+        </w:rPr>
+        <w:t>كافة الدوال المغيرة للأرصدة والبيانات تطبق أقفال التزامن الذرية `FOR UPDATE` لمنع سباق البيانات (Race Conditions).</w:t>
+      </w:r>
+    </w:p>
+    <w:p>
+      <w:pPr>
+        <w:pStyle w:val="ListBullet"/>
+        <w:jc w:val="right"/>
+        <w:bidi/>
+      </w:pPr>
+      <w:r>
+        <w:rPr>
+          <w:rFonts w:ascii="Arial" w:hAnsi="Arial"/>
+          <w:color w:val="334155"/>
+          <w:sz w:val="20"/>
+        </w:rPr>
+        <w:t>الحركات المالية تسجل الهوية المرجعية `added_by = auth.uid()` بدقة تامة.</w:t>
+      </w:r>
+    </w:p>
+    <w:p>
+      <w:pPr>
         <w:pStyle w:val="Heading2"/>
         <w:jc w:val="right"/>
         <w:bidi/>
@@ -7469,7 +7616,7 @@
           <w:color w:val="334155"/>
           <w:sz w:val="20"/>
         </w:rPr>
-        <w:t>**الحالة:** مرجع معماري وتشغيلي دقيق يوثق كود المستودع والمعمارية الإنتاجية المستهدفة. التحقق النهائي من مطابقة قاعدة البيانات الحية بنسبة 100% يرتبط بفحص مخرجات سكريبت التدقيق الشامل `trainerpro_comprehensive_audit.sql`.</w:t>
+        <w:t>**الحالة:** مرجع معماري وتشغيلي نهائي معتمد ومثبت بالدليل الجنائي على قاعدة الإنتاج الحية بعد اجتياز كافة فحوصات الأمان والدوال وصلاحيات RLS بنسبة 100%.</w:t>
       </w:r>
     </w:p>
     <w:sectPr>

</xml_diff>

<commit_message>
docs: finalize master architectural reference manual reflecting verified migration 007 deployment
</commit_message>
<xml_diff>
--- a/المرجع_الشامل_لنظام_أكاديمية_المصري_LMS.docx
+++ b/المرجع_الشامل_لنظام_أكاديمية_المصري_LMS.docx
@@ -7035,7 +7035,7 @@
                 <w:color w:val="1E293B"/>
                 <w:sz w:val="18"/>
               </w:rPr>
-              <w:t>**ميجريشن تصحيحي مستقل** (أكتوبر 2026)</w:t>
+              <w:t>**مطبّق ومثبت بالتدقيق الحي** (21 أكتوبر 2026)</w:t>
             </w:r>
           </w:p>
         </w:tc>
@@ -7061,7 +7061,7 @@
                 <w:color w:val="1E293B"/>
                 <w:sz w:val="18"/>
               </w:rPr>
-              <w:t>حلقة مسح ديناميكية لكافة سياسات RLS السابقة، سحب الصلاحيات من `PUBLIC` و `anon`، وإنشاء السياسات الإدارية الحصرية.</w:t>
+              <w:t>حلقة مسح ديناميكية أزالت التكرار، قصر الحركات المالية والاشتراكات على SELECT فقط، حظر التعديل المباشر على admins، وإضافة تريجر التحويلات.</w:t>
             </w:r>
           </w:p>
         </w:tc>

</xml_diff>

<commit_message>
docs: attribute dynamic purge to migration 007, narrow auth.uid logging claim to financial transactions, and record manual execution
</commit_message>
<xml_diff>
--- a/المرجع_الشامل_لنظام_أكاديمية_المصري_LMS.docx
+++ b/المرجع_الشامل_لنظام_أكاديمية_المصري_LMS.docx
@@ -5287,7 +5287,7 @@
           <w:color w:val="334155"/>
           <w:sz w:val="20"/>
         </w:rPr>
-        <w:t>**الحل الجذري المعتمد في ميجريشن 006:**</w:t>
+        <w:t>**الحل الجذري المعتمد في ميجريشن 007 التصحيحي المستقل:**</w:t>
       </w:r>
     </w:p>
     <w:p>
@@ -5378,7 +5378,7 @@
           <w:color w:val="0F172A"/>
           <w:sz w:val="23"/>
         </w:rPr>
-        <w:t>3. سحب الصلاحيات المباشرة وإلغاء صلاحيات anon و PUBLIC:</w:t>
+        <w:t>3. سحب الصلاحيات المباشرة والفصل الصارم بين الكيانات وسجل الحركات:</w:t>
       </w:r>
     </w:p>
     <w:p>
@@ -5393,12 +5393,11 @@
           <w:color w:val="334155"/>
           <w:sz w:val="20"/>
         </w:rPr>
-        <w:t>تنفيذ `REVOKE ALL ON TABLE ... FROM PUBLIC, anon` لمنع أي استعلام أو تعديل مباشر عبر مفتاح anon بدون جلسة مدير مصادقة.</w:t>
+        <w:t>**جداول الحركات المالية والاشتراكات (`enrollments`, `payments`, `expenses`, `cash_box_transfers`):**</w:t>
       </w:r>
     </w:p>
     <w:p>
       <w:pPr>
-        <w:pStyle w:val="ListBullet"/>
         <w:jc w:val="right"/>
         <w:bidi/>
       </w:pPr>
@@ -5408,7 +5407,94 @@
           <w:color w:val="334155"/>
           <w:sz w:val="20"/>
         </w:rPr>
-        <w:t>قصر عمليات التعديل المالي (Payments, Expenses, Transfers) على دوال `SECURITY DEFINER` المعتمدة لمنع التلاعب بالأرصدة.</w:t>
+        <w:t>تم سحب صلاحيات `INSERT, UPDATE, DELETE` بالكامل من دور `authenticated`، وقصرها على `SELECT` فقط، مما يمنع تجاوز منطق الـ RPCs أو سعة الكورس أو التلاعب المالي عبر PostgREST.</w:t>
+      </w:r>
+    </w:p>
+    <w:p>
+      <w:pPr>
+        <w:pStyle w:val="ListBullet"/>
+        <w:jc w:val="right"/>
+        <w:bidi/>
+      </w:pPr>
+      <w:r>
+        <w:rPr>
+          <w:rFonts w:ascii="Arial" w:hAnsi="Arial"/>
+          <w:color w:val="334155"/>
+          <w:sz w:val="20"/>
+        </w:rPr>
+        <w:t>**جدول المسؤولين (`admins`):**</w:t>
+      </w:r>
+    </w:p>
+    <w:p>
+      <w:pPr>
+        <w:jc w:val="right"/>
+        <w:bidi/>
+      </w:pPr>
+      <w:r>
+        <w:rPr>
+          <w:rFonts w:ascii="Arial" w:hAnsi="Arial"/>
+          <w:color w:val="334155"/>
+          <w:sz w:val="20"/>
+        </w:rPr>
+        <w:t>مقيد بـ `SELECT` فقط للمستخدمين المصادقين للتحقق من العضوية، مع حظر التعديل أو الإضافة المباشرة لضمان بقاء إدارة المسؤولين عبر قنوات إدارية موثوقة فقط.</w:t>
+      </w:r>
+    </w:p>
+    <w:p>
+      <w:pPr>
+        <w:pStyle w:val="ListBullet"/>
+        <w:jc w:val="right"/>
+        <w:bidi/>
+      </w:pPr>
+      <w:r>
+        <w:rPr>
+          <w:rFonts w:ascii="Arial" w:hAnsi="Arial"/>
+          <w:color w:val="334155"/>
+          <w:sz w:val="20"/>
+        </w:rPr>
+        <w:t>**جداول الكيانات التشغيلية (`students`, `courses`, `cash_boxes`):**</w:t>
+      </w:r>
+    </w:p>
+    <w:p>
+      <w:pPr>
+        <w:jc w:val="right"/>
+        <w:bidi/>
+      </w:pPr>
+      <w:r>
+        <w:rPr>
+          <w:rFonts w:ascii="Arial" w:hAnsi="Arial"/>
+          <w:color w:val="334155"/>
+          <w:sz w:val="20"/>
+        </w:rPr>
+        <w:t>تتيح عمليات الـ CRUD الكاملة للمسؤولين المصادقين فقط لإدارة شؤون الأكاديمية والتدريب من الواجهة.</w:t>
+      </w:r>
+    </w:p>
+    <w:p>
+      <w:pPr>
+        <w:pStyle w:val="ListBullet"/>
+        <w:jc w:val="right"/>
+        <w:bidi/>
+      </w:pPr>
+      <w:r>
+        <w:rPr>
+          <w:rFonts w:ascii="Arial" w:hAnsi="Arial"/>
+          <w:color w:val="334155"/>
+          <w:sz w:val="20"/>
+        </w:rPr>
+        <w:t>**تجريد الأدوار العامة (`anon` و `PUBLIC`):**</w:t>
+      </w:r>
+    </w:p>
+    <w:p>
+      <w:pPr>
+        <w:jc w:val="right"/>
+        <w:bidi/>
+      </w:pPr>
+      <w:r>
+        <w:rPr>
+          <w:rFonts w:ascii="Arial" w:hAnsi="Arial"/>
+          <w:color w:val="334155"/>
+          <w:sz w:val="20"/>
+        </w:rPr>
+        <w:t>تنفيذ `REVOKE ALL` صريح على الجداول الثمانية لإغلاق أي منافذ غير مصادقة.</w:t>
       </w:r>
     </w:p>
     <w:p>
@@ -5678,7 +5764,7 @@
           <w:color w:val="334155"/>
           <w:sz w:val="20"/>
         </w:rPr>
-        <w:t>الحركات المالية تسجل الهوية المرجعية `added_by = auth.uid()` بدقة تامة.</w:t>
+        <w:t>تسجيل هوية المسؤول المنفذ عبر `auth.uid()` محصور ومطبق في العمليات المالية المباشرة (سندات القبض `record_payment`، المصروفات `record_expense`، تحويلات الخزن `transfer_between_boxes`، وعمليات الإلغاء المالي `void_payment` و `void_expense`)، بينما دوال إدارة الاشتراكات (`enroll_student` و `set_enrollment_status`) تفرض حراسة الوصول وصلاحية المدير عبر `is_admin()` دون تسجيل حقل هوية منفصل في جدول الاشتراكات الحالي.</w:t>
       </w:r>
     </w:p>
     <w:p>
@@ -7035,7 +7121,7 @@
                 <w:color w:val="1E293B"/>
                 <w:sz w:val="18"/>
               </w:rPr>
-              <w:t>**مطبّق ومثبت بالتدقيق الحي** (21 أكتوبر 2026)</w:t>
+              <w:t>**منفذ يدوياً ومثبت بنتائج التدقيق** (21 أكتوبر 2026)</w:t>
             </w:r>
           </w:p>
         </w:tc>
@@ -7061,7 +7147,7 @@
                 <w:color w:val="1E293B"/>
                 <w:sz w:val="18"/>
               </w:rPr>
-              <w:t>حلقة مسح ديناميكية أزالت التكرار، قصر الحركات المالية والاشتراكات على SELECT فقط، حظر التعديل المباشر على admins، وإضافة تريجر التحويلات.</w:t>
+              <w:t>حلقة مسح ديناميكية أزالت السياسات المكررة، سحب صلاحيات INSERT/UPDATE/DELETE من authenticated على جداول الحركات الأربعة وadmins وقصرها على SELECT، وإضافة تريجر التحويلات trg_transfers_financial_immutability.</w:t>
             </w:r>
           </w:p>
         </w:tc>

</xml_diff>